<commit_message>
Don't hang up on a question after a goodbye; don't infer company facts
- end_call refuses (and lets the model answer) when the caller's last message looks
  like a question; prompt says a goodbye is never final on the agent's side
- Prompt forbids inferring office/staff/founding facts not in the document
- Codainer doc: honest "where are you located" FAQ

Co-Authored-By: Claude Fable 5.1 <noreply@anthropic.com>
</commit_message>
<xml_diff>
--- a/server/knowledge/Codainer.docx
+++ b/server/knowledge/Codainer.docx
@@ -673,6 +673,28 @@
           </w:p>
         </w:tc>
       </w:tr>
+      <w:tr>
+        <w:tc>
+          <w:tcPr>
+            <w:tcW w:type="dxa" w:w="4320"/>
+          </w:tcPr>
+          <w:p>
+            <w:r>
+              <w:t>Where are you located? Do you have an office in my city?</w:t>
+            </w:r>
+          </w:p>
+        </w:tc>
+        <w:tc>
+          <w:tcPr>
+            <w:tcW w:type="dxa" w:w="4320"/>
+          </w:tcPr>
+          <w:p>
+            <w:r>
+              <w:t>I don't have the office details on hand. The team works with service businesses across the United States, and I can have them confirm the specifics for your area on a quick call.</w:t>
+            </w:r>
+          </w:p>
+        </w:tc>
+      </w:tr>
     </w:tbl>
     <w:p/>
     <w:p>

</xml_diff>

<commit_message>
Latency pass: per-turn latency log, VAD stop 0.3s, cache-friendly prompt order, trimmed prompt, tool fillers
- UserBotLatencyObserver logs each turn's breakdown (endpointing, STT, LLM, TTS, total)
- VAD_STOP_SECS default 0.6 -> 0.3; Smart Turn handles mid-sentence pauses
- System prompt: static content first, "Today" last so providers can cache the prefix
  (Groq verified: 3072/3366 tokens cached on a hit); engine rules rewritten compactly;
  settings-only Basics rows no longer duplicated into the knowledge text; Codainer doc
  trimmed where it repeated itself. 4258 -> 3733 tokens
- "Let me check that for you" / "One moment while I book that" spoken while tools run

Co-Authored-By: Claude Fable 5.1 <noreply@anthropic.com>
</commit_message>
<xml_diff>
--- a/server/knowledge/Codainer.docx
+++ b/server/knowledge/Codainer.docx
@@ -296,7 +296,7 @@
     </w:p>
     <w:p>
       <w:r>
-        <w:t>What makes us different: we are platform-agnostic, building on whatever stack fits the client, such as GoHighLevel, Zapier, Make, n8n or custom code. We are model-agnostic, using OpenAI, Anthropic, Google or open-source models depending on cost, speed and quality. We are full-stack, combining automation, agentic AI, voice and chat in one connected system. And everything is custom-built around each client's real scripts, offers and processes, never templated.</w:t>
+        <w:t>What makes us different: platform-agnostic and model-agnostic, full-stack (automation, agentic AI, voice and chat in one connected system), and custom-built around each client's real scripts, offers and processes, never templated.</w:t>
       </w:r>
     </w:p>
     <w:p>
@@ -334,7 +334,7 @@
     </w:p>
     <w:p>
       <w:r>
-        <w:t>Result: businesses that answer every call around the clock typically convert more inbound calls into booked appointments and lose fewer leads to missed calls. The exact impact depends on call volume, which the team reviews on a call. We do not quote specific results until we have real client data.</w:t>
+        <w:t>Results: businesses that answer every call around the clock typically convert more inbound calls into booked appointments. The exact impact depends on call volume, which the team reviews on a call. Never quote specific results; there is no client data yet.</w:t>
       </w:r>
     </w:p>
     <w:p>

</xml_diff>